<commit_message>
Update Menjacnica Projektni zahtev.docx
Dodavanje podrske za mob tel i detaljniji opisi

Co-Authored-By: cofiix187 <186467664+cofiix187@users.noreply.github.com>
Co-Authored-By: OgnjenM86 <186404917+OgnjenM86@users.noreply.github.com>
</commit_message>
<xml_diff>
--- a/Menjacnica Projektni zahtev.docx
+++ b/Menjacnica Projektni zahtev.docx
@@ -577,159 +577,7 @@
     </w:p>
     <w:p>
       <w:pPr>
-        <w:jc w:val="center"/>
-        <w:rPr>
-          <w:sz w:val="48"/>
-          <w:szCs w:val="48"/>
-        </w:rPr>
-      </w:pPr>
-      <w:r>
-        <w:rPr>
-          <w:sz w:val="48"/>
-          <w:szCs w:val="48"/>
-        </w:rPr>
-        <w:lastRenderedPageBreak/>
-        <w:t>SADRZAJ</w:t>
-      </w:r>
-    </w:p>
-    <w:p>
-      <w:pPr>
-        <w:jc w:val="center"/>
-        <w:rPr>
-          <w:sz w:val="48"/>
-          <w:szCs w:val="48"/>
-        </w:rPr>
-      </w:pPr>
-    </w:p>
-    <w:p>
-      <w:pPr>
-        <w:jc w:val="center"/>
-        <w:rPr>
-          <w:sz w:val="48"/>
-          <w:szCs w:val="48"/>
-        </w:rPr>
-      </w:pPr>
-    </w:p>
-    <w:p>
-      <w:pPr>
-        <w:jc w:val="center"/>
-        <w:rPr>
-          <w:sz w:val="48"/>
-          <w:szCs w:val="48"/>
-        </w:rPr>
-      </w:pPr>
-    </w:p>
-    <w:p>
-      <w:pPr>
-        <w:jc w:val="center"/>
-        <w:rPr>
-          <w:sz w:val="48"/>
-          <w:szCs w:val="48"/>
-        </w:rPr>
-      </w:pPr>
-    </w:p>
-    <w:p>
-      <w:pPr>
-        <w:jc w:val="center"/>
-        <w:rPr>
-          <w:sz w:val="48"/>
-          <w:szCs w:val="48"/>
-        </w:rPr>
-      </w:pPr>
-    </w:p>
-    <w:p>
-      <w:pPr>
-        <w:jc w:val="center"/>
-        <w:rPr>
-          <w:sz w:val="48"/>
-          <w:szCs w:val="48"/>
-        </w:rPr>
-      </w:pPr>
-    </w:p>
-    <w:p>
-      <w:pPr>
-        <w:jc w:val="center"/>
-        <w:rPr>
-          <w:sz w:val="48"/>
-          <w:szCs w:val="48"/>
-        </w:rPr>
-      </w:pPr>
-    </w:p>
-    <w:p>
-      <w:pPr>
-        <w:jc w:val="center"/>
-        <w:rPr>
-          <w:sz w:val="48"/>
-          <w:szCs w:val="48"/>
-        </w:rPr>
-      </w:pPr>
-    </w:p>
-    <w:p>
-      <w:pPr>
-        <w:jc w:val="center"/>
-        <w:rPr>
-          <w:sz w:val="48"/>
-          <w:szCs w:val="48"/>
-        </w:rPr>
-      </w:pPr>
-    </w:p>
-    <w:p>
-      <w:pPr>
-        <w:jc w:val="center"/>
-        <w:rPr>
-          <w:sz w:val="48"/>
-          <w:szCs w:val="48"/>
-        </w:rPr>
-      </w:pPr>
-    </w:p>
-    <w:p>
-      <w:pPr>
-        <w:jc w:val="center"/>
-        <w:rPr>
-          <w:sz w:val="48"/>
-          <w:szCs w:val="48"/>
-        </w:rPr>
-      </w:pPr>
-    </w:p>
-    <w:p>
-      <w:pPr>
-        <w:jc w:val="center"/>
-        <w:rPr>
-          <w:sz w:val="48"/>
-          <w:szCs w:val="48"/>
-        </w:rPr>
-      </w:pPr>
-    </w:p>
-    <w:p>
-      <w:pPr>
-        <w:jc w:val="center"/>
-        <w:rPr>
-          <w:sz w:val="48"/>
-          <w:szCs w:val="48"/>
-        </w:rPr>
-      </w:pPr>
-    </w:p>
-    <w:p>
-      <w:pPr>
-        <w:jc w:val="center"/>
-        <w:rPr>
-          <w:sz w:val="48"/>
-          <w:szCs w:val="48"/>
-        </w:rPr>
-      </w:pPr>
-    </w:p>
-    <w:p>
-      <w:pPr>
-        <w:jc w:val="center"/>
-        <w:rPr>
-          <w:sz w:val="48"/>
-          <w:szCs w:val="48"/>
-        </w:rPr>
-      </w:pPr>
-    </w:p>
-    <w:p>
-      <w:pPr>
-        <w:jc w:val="center"/>
+        <w:ind w:firstLine="0"/>
         <w:rPr>
           <w:sz w:val="48"/>
           <w:szCs w:val="48"/>
@@ -754,7 +602,6 @@
           <w:rStyle w:val="IntenseEmphasis"/>
           <w:i w:val="0"/>
         </w:rPr>
-        <w:lastRenderedPageBreak/>
         <w:t>Uvod</w:t>
       </w:r>
       <w:proofErr w:type="spellEnd"/>
@@ -1118,6 +965,12 @@
         </w:rPr>
         <w:t>Prikaz aktuelnog kursa valuta</w:t>
       </w:r>
+      <w:r>
+        <w:rPr>
+          <w:lang w:val="de-DE"/>
+        </w:rPr>
+        <w:t>,</w:t>
+      </w:r>
     </w:p>
     <w:p>
       <w:pPr>
@@ -1134,7 +987,19 @@
         <w:rPr>
           <w:lang w:val="de-DE"/>
         </w:rPr>
-        <w:t xml:space="preserve">Istorija transkacije </w:t>
+        <w:t>Istorija transkacije</w:t>
+      </w:r>
+      <w:r>
+        <w:rPr>
+          <w:lang w:val="de-DE"/>
+        </w:rPr>
+        <w:t>,</w:t>
+      </w:r>
+      <w:r>
+        <w:rPr>
+          <w:lang w:val="de-DE"/>
+        </w:rPr>
+        <w:t xml:space="preserve"> </w:t>
       </w:r>
     </w:p>
     <w:p>
@@ -1264,13 +1129,7 @@
         <w:rPr>
           <w:lang w:val="de-DE"/>
         </w:rPr>
-        <w:t xml:space="preserve"> itd.</w:t>
-      </w:r>
-      <w:r>
-        <w:rPr>
-          <w:lang w:val="de-DE"/>
-        </w:rPr>
-        <w:t>);</w:t>
+        <w:t>)</w:t>
       </w:r>
     </w:p>
     <w:p>
@@ -1297,6 +1156,33 @@
           <w:lang w:val="de-DE"/>
         </w:rPr>
         <w:t>Slanje i primanje novca svuda u svetu</w:t>
+      </w:r>
+    </w:p>
+    <w:p>
+      <w:pPr>
+        <w:rPr>
+          <w:lang w:val="de-DE"/>
+        </w:rPr>
+      </w:pPr>
+      <w:r>
+        <w:rPr>
+          <w:lang w:val="de-DE"/>
+        </w:rPr>
+        <w:t>Mogucnost svih transakcija preko mobilne aplikacije</w:t>
+      </w:r>
+    </w:p>
+    <w:p>
+      <w:pPr>
+        <w:ind w:left="720" w:firstLine="0"/>
+        <w:rPr>
+          <w:lang w:val="de-DE"/>
+        </w:rPr>
+      </w:pPr>
+      <w:r>
+        <w:rPr>
+          <w:lang w:val="de-DE"/>
+        </w:rPr>
+        <w:t>Zakazivanje uplate racuna, npr. Svakog 15tog u mesecu da se uplati racun za mob. Tel i korisnik vise nema nikakvu obavezu prema racuna bice automaski placen, samo je neophodno imati sredstava na racunu</w:t>
       </w:r>
     </w:p>
     <w:p>
@@ -1428,6 +1314,7 @@
     </w:p>
     <w:p>
       <w:pPr>
+        <w:ind w:left="540" w:firstLine="180"/>
         <w:rPr>
           <w:lang w:val="de-DE"/>
         </w:rPr>
@@ -1468,97 +1355,61 @@
     </w:p>
     <w:p>
       <w:pPr>
-        <w:rPr>
-          <w:lang w:val="de-DE"/>
-        </w:rPr>
-      </w:pPr>
-      <w:r>
-        <w:rPr>
-          <w:lang w:val="de-DE"/>
-        </w:rPr>
-        <w:t>Program ne sme da sadrzi druge valute koje nisu unete vec samo one koje su vec prethodno navene.</w:t>
-      </w:r>
-    </w:p>
-    <w:p>
-      <w:pPr>
-        <w:rPr>
-          <w:lang w:val="de-DE"/>
-        </w:rPr>
-      </w:pPr>
-      <w:r>
-        <w:rPr>
-          <w:lang w:val="de-DE"/>
-        </w:rPr>
-        <w:t xml:space="preserve">Maksimalna uneta suma za primanje i slanje novca za </w:t>
-      </w:r>
-      <w:r>
-        <w:rPr>
-          <w:b/>
-          <w:lang w:val="de-DE"/>
-        </w:rPr>
-        <w:t>200.000</w:t>
-      </w:r>
-      <w:r>
-        <w:rPr>
-          <w:b/>
-          <w:lang w:val="de-DE"/>
-        </w:rPr>
-        <w:t xml:space="preserve"> </w:t>
-      </w:r>
-      <w:r>
-        <w:rPr>
-          <w:b/>
-          <w:lang w:val="de-DE"/>
-        </w:rPr>
-        <w:t>RSD</w:t>
-      </w:r>
-      <w:r>
-        <w:rPr>
-          <w:lang w:val="de-DE"/>
-        </w:rPr>
-        <w:t xml:space="preserve"> </w:t>
-      </w:r>
-    </w:p>
-    <w:p>
-      <w:pPr>
-        <w:rPr>
-          <w:b/>
-          <w:lang w:val="de-DE"/>
-        </w:rPr>
-      </w:pPr>
-      <w:r>
-        <w:rPr>
-          <w:lang w:val="de-DE"/>
-        </w:rPr>
-        <w:t xml:space="preserve">Maksimalna suma za razmenu novca je </w:t>
-      </w:r>
-      <w:r>
-        <w:rPr>
-          <w:b/>
-          <w:lang w:val="de-DE"/>
-        </w:rPr>
-        <w:t>100</w:t>
-      </w:r>
-      <w:r>
-        <w:rPr>
-          <w:b/>
-          <w:lang w:val="de-DE"/>
-        </w:rPr>
-        <w:t>.000 RSD</w:t>
-      </w:r>
-    </w:p>
-    <w:p>
-      <w:pPr>
-        <w:rPr>
-          <w:lang w:val="de-DE"/>
-        </w:rPr>
-      </w:pPr>
-      <w:r>
-        <w:rPr>
-          <w:lang w:val="de-DE"/>
-        </w:rPr>
-        <w:t>Maksimlana suma uplate racuna nije ugranicena</w:t>
-      </w:r>
+        <w:ind w:left="540" w:firstLine="180"/>
+        <w:rPr>
+          <w:lang w:val="de-DE"/>
+        </w:rPr>
+      </w:pPr>
+      <w:r>
+        <w:rPr>
+          <w:lang w:val="de-DE"/>
+        </w:rPr>
+        <w:t>Program ne sme da sadrzi druge valute koje nisu unete vec samo</w:t>
+      </w:r>
+      <w:r>
+        <w:rPr>
+          <w:lang w:val="de-DE"/>
+        </w:rPr>
+        <w:t xml:space="preserve"> one koje su vec prethodno naved</w:t>
+      </w:r>
+      <w:r>
+        <w:rPr>
+          <w:lang w:val="de-DE"/>
+        </w:rPr>
+        <w:t>e</w:t>
+      </w:r>
+      <w:r>
+        <w:rPr>
+          <w:lang w:val="de-DE"/>
+        </w:rPr>
+        <w:t>ne</w:t>
+      </w:r>
+      <w:r>
+        <w:rPr>
+          <w:lang w:val="de-DE"/>
+        </w:rPr>
+        <w:t>.</w:t>
+      </w:r>
+    </w:p>
+    <w:p>
+      <w:pPr>
+        <w:rPr>
+          <w:lang w:val="de-DE"/>
+        </w:rPr>
+      </w:pPr>
+      <w:r>
+        <w:rPr>
+          <w:lang w:val="de-DE"/>
+        </w:rPr>
+        <w:t>Maksimalna suma na racunu ne sme biti veca od 500.000RSD</w:t>
+      </w:r>
+    </w:p>
+    <w:p>
+      <w:pPr>
+        <w:rPr>
+          <w:lang w:val="de-DE"/>
+        </w:rPr>
+      </w:pPr>
     </w:p>
     <w:p>
       <w:pPr>
@@ -1673,13 +1524,13 @@
         <w:rPr>
           <w:lang w:val="de-DE"/>
         </w:rPr>
-        <w:t>Program treba da radi na all in one racunaru</w:t>
-      </w:r>
-      <w:r>
-        <w:rPr>
-          <w:lang w:val="de-DE"/>
-        </w:rPr>
-        <w:t xml:space="preserve">. </w:t>
+        <w:t xml:space="preserve">Program treba da radi na </w:t>
+      </w:r>
+      <w:r>
+        <w:rPr>
+          <w:lang w:val="de-DE"/>
+        </w:rPr>
+        <w:t xml:space="preserve">telefonima i all in one racunarima koji ce biti integrisani u jedinstvene bankomate. </w:t>
       </w:r>
       <w:r>
         <w:rPr>
@@ -1739,15 +1590,123 @@
     </w:p>
     <w:p>
       <w:pPr>
-        <w:rPr>
-          <w:lang w:val="de-DE"/>
-        </w:rPr>
-      </w:pPr>
-      <w:r>
-        <w:rPr>
-          <w:lang w:val="de-DE"/>
-        </w:rPr>
-        <w:t>U pocetnom meniu treba da budu velika polja za odabir usluge, uplata novca, menjaje novca i slanje / primanje novca. Nakon odabira zeljene usluge potrebno je popuniti informacije o usluzi i potvrditi informacije, nakon toga treba ubaciti novac u uredjaj ili uzeti iz njega.</w:t>
+        <w:ind w:left="720" w:firstLine="0"/>
+        <w:rPr>
+          <w:lang w:val="de-DE"/>
+        </w:rPr>
+      </w:pPr>
+      <w:r>
+        <w:rPr>
+          <w:lang w:val="de-DE"/>
+        </w:rPr>
+        <w:t xml:space="preserve">Prvi korak je prijavljivanje na nalog ili kreiranje naloga ako </w:t>
+      </w:r>
+      <w:r>
+        <w:rPr>
+          <w:lang w:val="de-DE"/>
+        </w:rPr>
+        <w:t xml:space="preserve">korisnik nema napravljen nalog. Za kreiranje naloga potreba je e-mail adresa sifra i broj telefona. Nakon toga stize poruka sa kodom za verifikaciju korisniku na telefon i neophodno je da taj kod unese u aplikaciju kako bi verifikovao svoj nalog. Kada se napravi nalog i korisnik se jednom prijavi u aplikaciji na telefon nije potrebno naknadno prijavljivanje, ali kada korisnik zeli da koristi bankomat moze da se uloguje pomogu jedinstvenog koda koji ce se automatski generisati prilikom kreiranja naloga ili uz pomoc mobilnog telefona preko </w:t>
+      </w:r>
+      <w:r>
+        <w:rPr>
+          <w:lang w:val="de-DE"/>
+        </w:rPr>
+        <w:t>Bluetooth</w:t>
+      </w:r>
+      <w:r>
+        <w:rPr>
+          <w:lang w:val="de-DE"/>
+        </w:rPr>
+        <w:t xml:space="preserve"> ili NFC tehnologija (Potrebno je prisloniti telefon ili biti u dometu od jednog metra) i samo prihvatiti prijavu preko telefona. </w:t>
+      </w:r>
+    </w:p>
+    <w:p>
+      <w:pPr>
+        <w:ind w:left="720" w:firstLine="0"/>
+        <w:rPr>
+          <w:lang w:val="de-DE"/>
+        </w:rPr>
+      </w:pPr>
+      <w:r>
+        <w:rPr>
+          <w:lang w:val="de-DE"/>
+        </w:rPr>
+        <w:t>U samoj aplikaciji korisnik moze da napravi „</w:t>
+      </w:r>
+      <w:r>
+        <w:rPr>
+          <w:lang w:val="de-DE"/>
+        </w:rPr>
+        <w:t xml:space="preserve">Sablon </w:t>
+      </w:r>
+      <w:r>
+        <w:rPr>
+          <w:lang w:val="de-DE"/>
+        </w:rPr>
+        <w:t>“</w:t>
+      </w:r>
+      <w:r>
+        <w:rPr>
+          <w:lang w:val="de-DE"/>
+        </w:rPr>
+        <w:t xml:space="preserve"> za obrazce odnosno da unese neophodne podatke za brze generisanje uplatnica i naravno brze placanje racuna taksi itd. Naravno ceo proces uplate ili slanja novca moze da radi i bez unaored napravljenog sablona samo sto ce korisnik morati svaki put iznova da popunjava uplatnice.  </w:t>
+      </w:r>
+    </w:p>
+    <w:p>
+      <w:pPr>
+        <w:ind w:left="720" w:firstLine="0"/>
+        <w:rPr>
+          <w:lang w:val="de-DE"/>
+        </w:rPr>
+      </w:pPr>
+      <w:r>
+        <w:rPr>
+          <w:lang w:val="de-DE"/>
+        </w:rPr>
+        <w:t xml:space="preserve">Menjaje novca se moze izvrsiti na licu mesta (Preko bankomata) i tako su moguce tri opcije: </w:t>
+      </w:r>
+    </w:p>
+    <w:p>
+      <w:pPr>
+        <w:ind w:left="720" w:firstLine="0"/>
+        <w:rPr>
+          <w:lang w:val="de-DE"/>
+        </w:rPr>
+      </w:pPr>
+      <w:r>
+        <w:rPr>
+          <w:lang w:val="de-DE"/>
+        </w:rPr>
+        <w:t>Prva opcije korisnik ubaci novac i izabere valutu u koju zeli da razmeni novac i bankomat mu vrati u drugoj valuti,</w:t>
+      </w:r>
+    </w:p>
+    <w:p>
+      <w:pPr>
+        <w:ind w:left="720" w:firstLine="0"/>
+        <w:rPr>
+          <w:lang w:val="de-DE"/>
+        </w:rPr>
+      </w:pPr>
+      <w:r>
+        <w:rPr>
+          <w:lang w:val="de-DE"/>
+        </w:rPr>
+        <w:lastRenderedPageBreak/>
+        <w:t>Druga opcije da korisnik izabere valutu u koju zeli da razmeni novac i kolicinu, npr. Zeli 10 evra i program ce mu ispisati da je neophodno da ubaci 1168din ,</w:t>
+      </w:r>
+    </w:p>
+    <w:p>
+      <w:pPr>
+        <w:ind w:left="720" w:firstLine="0"/>
+        <w:rPr>
+          <w:lang w:val="de-DE"/>
+        </w:rPr>
+      </w:pPr>
+      <w:r>
+        <w:rPr>
+          <w:lang w:val="de-DE"/>
+        </w:rPr>
+        <w:t>Treca opcije je mozda i najlaksa a to je da korisnik izabere kolicu novca koji zeli da podigne u toj valuti zatim ce bankomat da mu izbaci novac i sa njegovog racuna ce se umanjiti odgovarajuca suma.</w:t>
       </w:r>
     </w:p>
     <w:p>
@@ -1770,28 +1729,28 @@
           <w:b/>
           <w:lang w:val="de-DE"/>
         </w:rPr>
-        <w:t>3.2 Funkcije</w:t>
-      </w:r>
-    </w:p>
-    <w:p>
-      <w:pPr>
-        <w:rPr>
-          <w:lang w:val="de-DE"/>
-        </w:rPr>
-      </w:pPr>
-      <w:r>
-        <w:rPr>
-          <w:lang w:val="de-DE"/>
-        </w:rPr>
-        <w:t xml:space="preserve">Ovde treba UML diagram kompletan </w:t>
-      </w:r>
-    </w:p>
-    <w:p>
-      <w:pPr>
-        <w:rPr>
-          <w:lang w:val="de-DE"/>
-        </w:rPr>
-      </w:pPr>
+        <w:t xml:space="preserve">3.4 Zahtevane performanse </w:t>
+      </w:r>
+    </w:p>
+    <w:p>
+      <w:pPr>
+        <w:ind w:left="720" w:firstLine="0"/>
+        <w:rPr>
+          <w:lang w:val="de-DE"/>
+        </w:rPr>
+      </w:pPr>
+      <w:r>
+        <w:rPr>
+          <w:lang w:val="de-DE"/>
+        </w:rPr>
+        <w:t>Program ne sme da bude previse zahtevan</w:t>
+      </w:r>
+      <w:r>
+        <w:rPr>
+          <w:lang w:val="de-DE"/>
+        </w:rPr>
+        <w:t xml:space="preserve"> zbog toga sto ima korisnika sa starijim mob. Telefonima pa da mogu i oni da pokrenu i koriste aplikaciju bez problema.</w:t>
+      </w:r>
     </w:p>
     <w:p>
       <w:pPr>
@@ -1806,7 +1765,7 @@
           <w:b/>
           <w:lang w:val="de-DE"/>
         </w:rPr>
-        <w:t xml:space="preserve">3.4 Zahtevane performanse </w:t>
+        <w:t>3.5 Zahtevi za baze podataka</w:t>
       </w:r>
     </w:p>
     <w:p>
@@ -1820,7 +1779,54 @@
         <w:rPr>
           <w:lang w:val="de-DE"/>
         </w:rPr>
-        <w:t>Program mora biti uradjen tako da mogu all in one racunari da ga pokrenu bez problema.</w:t>
+        <w:t>Nemamo jasno definisanu bazu podataka koja je neophodna za ovaj program, samo je bitno da baza po</w:t>
+      </w:r>
+      <w:r>
+        <w:rPr>
+          <w:lang w:val="de-DE"/>
+        </w:rPr>
+        <w:t>da</w:t>
+      </w:r>
+      <w:r>
+        <w:rPr>
+          <w:lang w:val="de-DE"/>
+        </w:rPr>
+        <w:t>taka bude veoma sigurna jer se radi o velikoj kolici</w:t>
+      </w:r>
+      <w:r>
+        <w:rPr>
+          <w:lang w:val="de-DE"/>
+        </w:rPr>
+        <w:t>ni</w:t>
+      </w:r>
+      <w:r>
+        <w:rPr>
+          <w:lang w:val="de-DE"/>
+        </w:rPr>
+        <w:t xml:space="preserve"> novca i radi se vaznim podacima.</w:t>
+      </w:r>
+    </w:p>
+    <w:p>
+      <w:pPr>
+        <w:rPr>
+          <w:lang w:val="de-DE"/>
+        </w:rPr>
+      </w:pPr>
+    </w:p>
+    <w:p>
+      <w:pPr>
+        <w:pStyle w:val="Heading2"/>
+        <w:rPr>
+          <w:b/>
+          <w:lang w:val="de-DE"/>
+        </w:rPr>
+      </w:pPr>
+      <w:r>
+        <w:rPr>
+          <w:b/>
+          <w:lang w:val="de-DE"/>
+        </w:rPr>
+        <w:t xml:space="preserve">3.7 Sistemske karakteristike softvera sistema </w:t>
       </w:r>
     </w:p>
     <w:p>
@@ -1834,11 +1840,24 @@
         <w:rPr>
           <w:lang w:val="de-DE"/>
         </w:rPr>
-        <w:t>Na jednom uredjaju tj. Bankomatu omoguceno je koriscenje samo za jednu osobu.</w:t>
-      </w:r>
-    </w:p>
-    <w:p>
-      <w:pPr>
+        <w:t xml:space="preserve">Sam </w:t>
+      </w:r>
+      <w:r>
+        <w:rPr>
+          <w:lang w:val="de-DE"/>
+        </w:rPr>
+        <w:t xml:space="preserve">program odnosno aplikacija </w:t>
+      </w:r>
+      <w:r>
+        <w:rPr>
+          <w:lang w:val="de-DE"/>
+        </w:rPr>
+        <w:t>treba da bude pouzdan, siguran, jednostavan i naravno pogodan za dalje azuriranje.</w:t>
+      </w:r>
+    </w:p>
+    <w:p>
+      <w:pPr>
+        <w:ind w:left="720" w:firstLine="0"/>
         <w:rPr>
           <w:lang w:val="de-DE"/>
         </w:rPr>
@@ -1857,8 +1876,7 @@
           <w:b/>
           <w:lang w:val="de-DE"/>
         </w:rPr>
-        <w:lastRenderedPageBreak/>
-        <w:t>3.5 Zahtevi za baze podataka</w:t>
+        <w:t>4. Verifikacije</w:t>
       </w:r>
     </w:p>
     <w:p>
@@ -1868,15 +1886,24 @@
           <w:lang w:val="de-DE"/>
         </w:rPr>
       </w:pPr>
-      <w:r>
-        <w:rPr>
-          <w:lang w:val="de-DE"/>
-        </w:rPr>
-        <w:t>Nemamo jasno definisanu bazu podataka koja je neophodna za ovaj program, samo je bitno da baza potaka bude veoma sigurna jer se radi o velikoj kolici novca i radi se vaznim podacima.</w:t>
-      </w:r>
-    </w:p>
-    <w:p>
-      <w:pPr>
+    </w:p>
+    <w:p>
+      <w:pPr>
+        <w:ind w:left="720" w:firstLine="0"/>
+        <w:rPr>
+          <w:lang w:val="de-DE"/>
+        </w:rPr>
+      </w:pPr>
+      <w:r>
+        <w:rPr>
+          <w:lang w:val="de-DE"/>
+        </w:rPr>
+        <w:t>Cilj verifikacije je osigurati bezbednost platforme I zastititi korisnike od potencijalnih prevara, sto je kljucno za poverenje u online menjacnicu.</w:t>
+      </w:r>
+    </w:p>
+    <w:p>
+      <w:pPr>
+        <w:ind w:left="720" w:firstLine="0"/>
         <w:rPr>
           <w:lang w:val="de-DE"/>
         </w:rPr>
@@ -1895,7 +1922,7 @@
           <w:b/>
           <w:lang w:val="de-DE"/>
         </w:rPr>
-        <w:t xml:space="preserve">3.7 Sistemske karakteristike softvera sistema </w:t>
+        <w:t>4.1. Korisnička Registracija i Prva Verifikacija</w:t>
       </w:r>
     </w:p>
     <w:p>
@@ -1909,7 +1936,7 @@
         <w:rPr>
           <w:lang w:val="de-DE"/>
         </w:rPr>
-        <w:t>Sam softver treba da bude pouzdan, siguran, jednostavan i naravno pogodan za dalje azuriranje.</w:t>
+        <w:t xml:space="preserve">Korisnik pri verifikaciji unosi osnovne podatke kao sto su ime, prezime, email, adresa I broj telefona. </w:t>
       </w:r>
     </w:p>
     <w:p>
@@ -1919,6 +1946,40 @@
           <w:lang w:val="de-DE"/>
         </w:rPr>
       </w:pPr>
+      <w:r>
+        <w:rPr>
+          <w:lang w:val="de-DE"/>
+        </w:rPr>
+        <w:t>Automatski se salji verifikacioni kod putem email-a ili SMS-a koji korisnik mora uneti kako bi potvrdio svoj identitet.</w:t>
+      </w:r>
+    </w:p>
+    <w:p>
+      <w:pPr>
+        <w:pStyle w:val="Heading2"/>
+        <w:rPr>
+          <w:rFonts w:ascii="Areal RNIDS" w:eastAsia="Calibri" w:hAnsi="Areal RNIDS" w:cstheme="minorBidi"/>
+          <w:color w:val="auto"/>
+          <w:sz w:val="24"/>
+          <w:szCs w:val="24"/>
+          <w:lang w:val="de-DE"/>
+        </w:rPr>
+      </w:pPr>
+    </w:p>
+    <w:p>
+      <w:pPr>
+        <w:pStyle w:val="Heading2"/>
+        <w:rPr>
+          <w:b/>
+          <w:lang w:val="de-DE"/>
+        </w:rPr>
+      </w:pPr>
+      <w:r>
+        <w:rPr>
+          <w:b/>
+          <w:lang w:val="de-DE"/>
+        </w:rPr>
+        <w:t>4.2. Identifikacija putem KYC Protokola</w:t>
+      </w:r>
     </w:p>
     <w:p>
       <w:pPr>
@@ -1927,9 +1988,16 @@
           <w:lang w:val="de-DE"/>
         </w:rPr>
       </w:pPr>
-    </w:p>
-    <w:p>
-      <w:pPr>
+      <w:r>
+        <w:rPr>
+          <w:lang w:val="de-DE"/>
+        </w:rPr>
+        <w:t>Korisnik mora dostaviti informacije prema KYC (Know Your Customer) standardima, ukljucujuci validan document ili selfi fotografiju.</w:t>
+      </w:r>
+    </w:p>
+    <w:p>
+      <w:pPr>
+        <w:ind w:left="720" w:firstLine="0"/>
         <w:rPr>
           <w:lang w:val="de-DE"/>
         </w:rPr>
@@ -1939,168 +2007,37 @@
       <w:pPr>
         <w:pStyle w:val="Heading2"/>
         <w:rPr>
-          <w:rStyle w:val="IntenseEmphasis"/>
-          <w:b/>
-          <w:i w:val="0"/>
-          <w:sz w:val="36"/>
-          <w:szCs w:val="36"/>
-        </w:rPr>
-      </w:pPr>
-      <w:r>
-        <w:rPr>
-          <w:rStyle w:val="IntenseEmphasis"/>
-          <w:b/>
-          <w:i w:val="0"/>
-          <w:sz w:val="36"/>
-          <w:szCs w:val="36"/>
-        </w:rPr>
-        <w:t xml:space="preserve">4. </w:t>
-      </w:r>
-      <w:proofErr w:type="spellStart"/>
-      <w:r>
-        <w:rPr>
-          <w:rStyle w:val="IntenseEmphasis"/>
-          <w:b/>
-          <w:i w:val="0"/>
-          <w:sz w:val="36"/>
-          <w:szCs w:val="36"/>
-        </w:rPr>
-        <w:t>Verifikacije</w:t>
-      </w:r>
-      <w:proofErr w:type="spellEnd"/>
-    </w:p>
-    <w:p/>
-    <w:p>
-      <w:pPr>
-        <w:pStyle w:val="NoSpacing"/>
+          <w:b/>
+          <w:lang w:val="de-DE"/>
+        </w:rPr>
+      </w:pPr>
+      <w:r>
+        <w:rPr>
+          <w:b/>
+          <w:lang w:val="de-DE"/>
+        </w:rPr>
+        <w:t>4.3. Provera Poreske Rezidentnosti (za AML standarde)</w:t>
+      </w:r>
+    </w:p>
+    <w:p>
+      <w:pPr>
         <w:ind w:left="720" w:firstLine="0"/>
-      </w:pPr>
-      <w:proofErr w:type="spellStart"/>
-      <w:r>
-        <w:t>Cilj</w:t>
-      </w:r>
-      <w:proofErr w:type="spellEnd"/>
-      <w:r>
-        <w:t xml:space="preserve"> </w:t>
-      </w:r>
-      <w:proofErr w:type="spellStart"/>
-      <w:r>
-        <w:t>verifikacije</w:t>
-      </w:r>
-      <w:proofErr w:type="spellEnd"/>
-      <w:r>
-        <w:t xml:space="preserve"> je </w:t>
-      </w:r>
-      <w:proofErr w:type="spellStart"/>
-      <w:r>
-        <w:t>osigurati</w:t>
-      </w:r>
-      <w:proofErr w:type="spellEnd"/>
-      <w:r>
-        <w:t xml:space="preserve"> </w:t>
-      </w:r>
-      <w:proofErr w:type="spellStart"/>
-      <w:r>
-        <w:t>bezbednost</w:t>
-      </w:r>
-      <w:proofErr w:type="spellEnd"/>
-      <w:r>
-        <w:t xml:space="preserve"> </w:t>
-      </w:r>
-      <w:proofErr w:type="spellStart"/>
-      <w:r>
-        <w:t>platforme</w:t>
-      </w:r>
-      <w:proofErr w:type="spellEnd"/>
-      <w:r>
-        <w:t xml:space="preserve"> I </w:t>
-      </w:r>
-      <w:proofErr w:type="spellStart"/>
-      <w:r>
-        <w:t>zastititi</w:t>
-      </w:r>
-      <w:proofErr w:type="spellEnd"/>
-      <w:r>
-        <w:t xml:space="preserve"> </w:t>
-      </w:r>
-      <w:proofErr w:type="spellStart"/>
-      <w:r>
-        <w:t>korisnike</w:t>
-      </w:r>
-      <w:proofErr w:type="spellEnd"/>
-      <w:r>
-        <w:t xml:space="preserve"> </w:t>
-      </w:r>
-      <w:proofErr w:type="spellStart"/>
-      <w:r>
-        <w:t>od</w:t>
-      </w:r>
-      <w:proofErr w:type="spellEnd"/>
-      <w:r>
-        <w:t xml:space="preserve"> </w:t>
-      </w:r>
-      <w:proofErr w:type="spellStart"/>
-      <w:r>
-        <w:t>potencijalnih</w:t>
-      </w:r>
-      <w:proofErr w:type="spellEnd"/>
-      <w:r>
-        <w:t xml:space="preserve"> </w:t>
-      </w:r>
-      <w:proofErr w:type="spellStart"/>
-      <w:r>
-        <w:t>prevara</w:t>
-      </w:r>
-      <w:proofErr w:type="spellEnd"/>
-      <w:r>
-        <w:t xml:space="preserve">, </w:t>
-      </w:r>
-      <w:proofErr w:type="spellStart"/>
-      <w:r>
-        <w:t>sto</w:t>
-      </w:r>
-      <w:proofErr w:type="spellEnd"/>
-      <w:r>
-        <w:t xml:space="preserve"> je </w:t>
-      </w:r>
-      <w:proofErr w:type="spellStart"/>
-      <w:r>
-        <w:t>kljucno</w:t>
-      </w:r>
-      <w:proofErr w:type="spellEnd"/>
-      <w:r>
-        <w:t xml:space="preserve"> </w:t>
-      </w:r>
-      <w:proofErr w:type="spellStart"/>
-      <w:r>
-        <w:t>za</w:t>
-      </w:r>
-      <w:proofErr w:type="spellEnd"/>
-      <w:r>
-        <w:t xml:space="preserve"> </w:t>
-      </w:r>
-      <w:proofErr w:type="spellStart"/>
-      <w:r>
-        <w:t>poverenje</w:t>
-      </w:r>
-      <w:proofErr w:type="spellEnd"/>
-      <w:r>
-        <w:t xml:space="preserve"> u online </w:t>
-      </w:r>
-      <w:proofErr w:type="spellStart"/>
-      <w:r>
-        <w:t>menjacnicu</w:t>
-      </w:r>
-      <w:proofErr w:type="spellEnd"/>
-      <w:r>
-        <w:t>.</w:t>
-      </w:r>
-    </w:p>
-    <w:p>
-      <w:pPr>
-        <w:jc w:val="left"/>
-        <w:rPr>
-          <w:rFonts w:cs="Arial"/>
+        <w:rPr>
+          <w:lang w:val="de-DE"/>
+        </w:rPr>
+      </w:pPr>
+      <w:r>
+        <w:rPr>
+          <w:lang w:val="de-DE"/>
+        </w:rPr>
+        <w:t>Korisnik treba da navede drzavy poreske rezidentnosti kao I TIN (Taxpayer Identification Number) ukoliko je primenljivo. Podaci se uporedjuju na medjunarodnim bazama kako bi se sprecile sve prevare, svako pranje novca ili druge ilegalne aktivnosti.</w:t>
+      </w:r>
+    </w:p>
+    <w:p>
+      <w:pPr>
+        <w:ind w:left="720" w:firstLine="0"/>
+        <w:rPr>
+          <w:lang w:val="de-DE"/>
         </w:rPr>
       </w:pPr>
     </w:p>
@@ -2109,1012 +2046,91 @@
         <w:pStyle w:val="Heading2"/>
         <w:rPr>
           <w:b/>
-        </w:rPr>
-      </w:pPr>
-      <w:r>
-        <w:rPr>
-          <w:b/>
-        </w:rPr>
-        <w:t xml:space="preserve">4.1. </w:t>
-      </w:r>
-      <w:proofErr w:type="spellStart"/>
-      <w:r>
-        <w:rPr>
-          <w:b/>
-        </w:rPr>
-        <w:t>Korisnička</w:t>
-      </w:r>
-      <w:proofErr w:type="spellEnd"/>
-      <w:r>
-        <w:rPr>
-          <w:b/>
-        </w:rPr>
-        <w:t xml:space="preserve"> </w:t>
-      </w:r>
-      <w:proofErr w:type="spellStart"/>
-      <w:r>
-        <w:rPr>
-          <w:b/>
-        </w:rPr>
-        <w:t>Registracija</w:t>
-      </w:r>
-      <w:proofErr w:type="spellEnd"/>
-      <w:r>
-        <w:rPr>
-          <w:b/>
-        </w:rPr>
-        <w:t xml:space="preserve"> </w:t>
-      </w:r>
-      <w:proofErr w:type="spellStart"/>
-      <w:r>
-        <w:rPr>
-          <w:b/>
-        </w:rPr>
-        <w:t>i</w:t>
-      </w:r>
-      <w:proofErr w:type="spellEnd"/>
-      <w:r>
-        <w:rPr>
-          <w:b/>
-        </w:rPr>
-        <w:t xml:space="preserve"> Prva </w:t>
-      </w:r>
-      <w:proofErr w:type="spellStart"/>
-      <w:r>
-        <w:rPr>
-          <w:b/>
-        </w:rPr>
-        <w:t>Verifikacija</w:t>
-      </w:r>
-      <w:proofErr w:type="spellEnd"/>
+          <w:lang w:val="de-DE"/>
+        </w:rPr>
+      </w:pPr>
+      <w:r>
+        <w:rPr>
+          <w:b/>
+          <w:lang w:val="de-DE"/>
+        </w:rPr>
+        <w:t>4.4. Dodatne Bezbednosne Mere</w:t>
+      </w:r>
     </w:p>
     <w:p>
       <w:pPr>
         <w:ind w:left="720" w:firstLine="0"/>
-      </w:pPr>
-      <w:proofErr w:type="spellStart"/>
-      <w:r>
-        <w:t>Korisnik</w:t>
-      </w:r>
-      <w:proofErr w:type="spellEnd"/>
-      <w:r>
-        <w:t xml:space="preserve"> </w:t>
-      </w:r>
-      <w:proofErr w:type="spellStart"/>
-      <w:r>
-        <w:t>pri</w:t>
-      </w:r>
-      <w:proofErr w:type="spellEnd"/>
-      <w:r>
-        <w:t xml:space="preserve"> </w:t>
-      </w:r>
-      <w:proofErr w:type="spellStart"/>
-      <w:r>
-        <w:t>verifikaciji</w:t>
-      </w:r>
-      <w:proofErr w:type="spellEnd"/>
-      <w:r>
-        <w:t xml:space="preserve"> </w:t>
-      </w:r>
-      <w:proofErr w:type="spellStart"/>
-      <w:r>
-        <w:t>unosi</w:t>
-      </w:r>
-      <w:proofErr w:type="spellEnd"/>
-      <w:r>
-        <w:t xml:space="preserve"> </w:t>
-      </w:r>
-      <w:proofErr w:type="spellStart"/>
-      <w:r>
-        <w:t>osnovne</w:t>
-      </w:r>
-      <w:proofErr w:type="spellEnd"/>
-      <w:r>
-        <w:t xml:space="preserve"> </w:t>
-      </w:r>
-      <w:proofErr w:type="spellStart"/>
-      <w:r>
-        <w:t>podatke</w:t>
-      </w:r>
-      <w:proofErr w:type="spellEnd"/>
-      <w:r>
-        <w:t xml:space="preserve"> </w:t>
-      </w:r>
-      <w:proofErr w:type="spellStart"/>
-      <w:r>
-        <w:t>kao</w:t>
-      </w:r>
-      <w:proofErr w:type="spellEnd"/>
-      <w:r>
-        <w:t xml:space="preserve"> </w:t>
-      </w:r>
-      <w:proofErr w:type="spellStart"/>
-      <w:r>
-        <w:t>sto</w:t>
-      </w:r>
-      <w:proofErr w:type="spellEnd"/>
-      <w:r>
-        <w:t xml:space="preserve"> </w:t>
-      </w:r>
-      <w:proofErr w:type="spellStart"/>
-      <w:r>
-        <w:t>su</w:t>
-      </w:r>
-      <w:proofErr w:type="spellEnd"/>
-      <w:r>
-        <w:t xml:space="preserve"> </w:t>
-      </w:r>
-      <w:proofErr w:type="spellStart"/>
-      <w:r>
-        <w:t>ime</w:t>
-      </w:r>
-      <w:proofErr w:type="spellEnd"/>
-      <w:r>
-        <w:t xml:space="preserve">, </w:t>
-      </w:r>
-      <w:proofErr w:type="spellStart"/>
-      <w:r>
-        <w:t>prezime</w:t>
-      </w:r>
-      <w:proofErr w:type="spellEnd"/>
-      <w:r>
-        <w:t xml:space="preserve">, email, </w:t>
-      </w:r>
-      <w:proofErr w:type="spellStart"/>
-      <w:r>
-        <w:t>adresa</w:t>
-      </w:r>
-      <w:proofErr w:type="spellEnd"/>
-      <w:r>
-        <w:t xml:space="preserve"> I </w:t>
-      </w:r>
-      <w:proofErr w:type="spellStart"/>
-      <w:r>
-        <w:t>broj</w:t>
-      </w:r>
-      <w:proofErr w:type="spellEnd"/>
-      <w:r>
-        <w:t xml:space="preserve"> </w:t>
-      </w:r>
-      <w:proofErr w:type="spellStart"/>
-      <w:r>
-        <w:t>telefona</w:t>
-      </w:r>
-      <w:proofErr w:type="spellEnd"/>
-      <w:r>
-        <w:t xml:space="preserve">. </w:t>
+        <w:rPr>
+          <w:lang w:val="de-DE"/>
+        </w:rPr>
+      </w:pPr>
+      <w:r>
+        <w:rPr>
+          <w:lang w:val="de-DE"/>
+        </w:rPr>
+        <w:t>- Dvostruka autentifikacija (2FA)</w:t>
       </w:r>
     </w:p>
     <w:p>
       <w:pPr>
         <w:ind w:left="720" w:firstLine="0"/>
-      </w:pPr>
-      <w:proofErr w:type="spellStart"/>
-      <w:r>
-        <w:t>Automatski</w:t>
-      </w:r>
-      <w:proofErr w:type="spellEnd"/>
-      <w:r>
-        <w:t xml:space="preserve"> se </w:t>
-      </w:r>
-      <w:proofErr w:type="spellStart"/>
-      <w:r>
-        <w:t>salji</w:t>
-      </w:r>
-      <w:proofErr w:type="spellEnd"/>
-      <w:r>
-        <w:t xml:space="preserve"> </w:t>
-      </w:r>
-      <w:proofErr w:type="spellStart"/>
-      <w:r>
-        <w:t>verifikacioni</w:t>
-      </w:r>
-      <w:proofErr w:type="spellEnd"/>
-      <w:r>
-        <w:t xml:space="preserve"> </w:t>
-      </w:r>
-      <w:proofErr w:type="spellStart"/>
-      <w:r>
-        <w:t>kod</w:t>
-      </w:r>
-      <w:proofErr w:type="spellEnd"/>
-      <w:r>
-        <w:t xml:space="preserve"> </w:t>
-      </w:r>
-      <w:proofErr w:type="spellStart"/>
-      <w:r>
-        <w:t>putem</w:t>
-      </w:r>
-      <w:proofErr w:type="spellEnd"/>
-      <w:r>
-        <w:t xml:space="preserve"> email-a </w:t>
-      </w:r>
-      <w:proofErr w:type="spellStart"/>
-      <w:r>
-        <w:t>ili</w:t>
-      </w:r>
-      <w:proofErr w:type="spellEnd"/>
-      <w:r>
-        <w:t xml:space="preserve"> SMS-a </w:t>
-      </w:r>
-      <w:proofErr w:type="spellStart"/>
-      <w:r>
-        <w:t>koji</w:t>
-      </w:r>
-      <w:proofErr w:type="spellEnd"/>
-      <w:r>
-        <w:t xml:space="preserve"> </w:t>
-      </w:r>
-      <w:proofErr w:type="spellStart"/>
-      <w:r>
-        <w:t>korisnik</w:t>
-      </w:r>
-      <w:proofErr w:type="spellEnd"/>
-      <w:r>
-        <w:t xml:space="preserve"> mora </w:t>
-      </w:r>
-      <w:proofErr w:type="spellStart"/>
-      <w:r>
-        <w:t>uneti</w:t>
-      </w:r>
-      <w:proofErr w:type="spellEnd"/>
-      <w:r>
-        <w:t xml:space="preserve"> </w:t>
-      </w:r>
-      <w:proofErr w:type="spellStart"/>
-      <w:r>
-        <w:t>kako</w:t>
-      </w:r>
-      <w:proofErr w:type="spellEnd"/>
-      <w:r>
-        <w:t xml:space="preserve"> bi </w:t>
-      </w:r>
-      <w:proofErr w:type="spellStart"/>
-      <w:r>
-        <w:t>potvrdio</w:t>
-      </w:r>
-      <w:proofErr w:type="spellEnd"/>
-      <w:r>
-        <w:t xml:space="preserve"> </w:t>
-      </w:r>
-      <w:proofErr w:type="spellStart"/>
-      <w:r>
-        <w:t>svoj</w:t>
-      </w:r>
-      <w:proofErr w:type="spellEnd"/>
-      <w:r>
-        <w:t xml:space="preserve"> </w:t>
-      </w:r>
-      <w:proofErr w:type="spellStart"/>
-      <w:r>
-        <w:t>identitet</w:t>
-      </w:r>
-      <w:proofErr w:type="spellEnd"/>
-      <w:r>
-        <w:t>.</w:t>
-      </w:r>
-    </w:p>
-    <w:p/>
+        <w:rPr>
+          <w:lang w:val="de-DE"/>
+        </w:rPr>
+      </w:pPr>
+      <w:r>
+        <w:rPr>
+          <w:lang w:val="de-DE"/>
+        </w:rPr>
+        <w:t>- Ogranicenje za rizicne IP adrese</w:t>
+      </w:r>
+    </w:p>
+    <w:p>
+      <w:pPr>
+        <w:ind w:left="720" w:firstLine="0"/>
+        <w:rPr>
+          <w:lang w:val="de-DE"/>
+        </w:rPr>
+      </w:pPr>
+    </w:p>
     <w:p>
       <w:pPr>
         <w:pStyle w:val="Heading2"/>
         <w:rPr>
           <w:b/>
-        </w:rPr>
-      </w:pPr>
-      <w:r>
-        <w:rPr>
-          <w:b/>
-        </w:rPr>
-        <w:t xml:space="preserve">4.2. </w:t>
-      </w:r>
-      <w:proofErr w:type="spellStart"/>
-      <w:r>
-        <w:rPr>
-          <w:b/>
-        </w:rPr>
-        <w:t>Identifikacija</w:t>
-      </w:r>
-      <w:proofErr w:type="spellEnd"/>
-      <w:r>
-        <w:rPr>
-          <w:b/>
-        </w:rPr>
-        <w:t xml:space="preserve"> </w:t>
-      </w:r>
-      <w:proofErr w:type="spellStart"/>
-      <w:r>
-        <w:rPr>
-          <w:b/>
-        </w:rPr>
-        <w:t>putem</w:t>
-      </w:r>
-      <w:proofErr w:type="spellEnd"/>
-      <w:r>
-        <w:rPr>
-          <w:b/>
-        </w:rPr>
-        <w:t xml:space="preserve"> KYC </w:t>
-      </w:r>
-      <w:proofErr w:type="spellStart"/>
-      <w:r>
-        <w:rPr>
-          <w:b/>
-        </w:rPr>
-        <w:t>Protokola</w:t>
-      </w:r>
-      <w:proofErr w:type="spellEnd"/>
+          <w:lang w:val="de-DE"/>
+        </w:rPr>
+      </w:pPr>
+      <w:r>
+        <w:rPr>
+          <w:b/>
+          <w:lang w:val="de-DE"/>
+        </w:rPr>
+        <w:t>4.5. Periodična Verifikacija</w:t>
+      </w:r>
     </w:p>
     <w:p>
       <w:pPr>
         <w:ind w:left="720" w:firstLine="0"/>
-      </w:pPr>
-      <w:proofErr w:type="spellStart"/>
-      <w:r>
-        <w:t>Korisnik</w:t>
-      </w:r>
-      <w:proofErr w:type="spellEnd"/>
-      <w:r>
-        <w:t xml:space="preserve"> mora </w:t>
-      </w:r>
-      <w:proofErr w:type="spellStart"/>
-      <w:r>
-        <w:t>dostaviti</w:t>
-      </w:r>
-      <w:proofErr w:type="spellEnd"/>
-      <w:r>
-        <w:t xml:space="preserve"> </w:t>
-      </w:r>
-      <w:proofErr w:type="spellStart"/>
-      <w:r>
-        <w:t>informacije</w:t>
-      </w:r>
-      <w:proofErr w:type="spellEnd"/>
-      <w:r>
-        <w:t xml:space="preserve"> </w:t>
-      </w:r>
-      <w:proofErr w:type="spellStart"/>
-      <w:r>
-        <w:t>prema</w:t>
-      </w:r>
-      <w:proofErr w:type="spellEnd"/>
-      <w:r>
-        <w:t xml:space="preserve"> KYC (Know Your Customer) </w:t>
-      </w:r>
-      <w:proofErr w:type="spellStart"/>
-      <w:r>
-        <w:t>standardima</w:t>
-      </w:r>
-      <w:proofErr w:type="spellEnd"/>
-      <w:r>
-        <w:t xml:space="preserve">, </w:t>
-      </w:r>
-      <w:proofErr w:type="spellStart"/>
-      <w:r>
-        <w:t>ukljucujuci</w:t>
-      </w:r>
-      <w:proofErr w:type="spellEnd"/>
-      <w:r>
-        <w:t xml:space="preserve"> </w:t>
-      </w:r>
-      <w:proofErr w:type="spellStart"/>
-      <w:r>
-        <w:t>validan</w:t>
-      </w:r>
-      <w:proofErr w:type="spellEnd"/>
-      <w:r>
-        <w:t xml:space="preserve"> document </w:t>
-      </w:r>
-      <w:proofErr w:type="spellStart"/>
-      <w:r>
-        <w:t>ili</w:t>
-      </w:r>
-      <w:proofErr w:type="spellEnd"/>
-      <w:r>
-        <w:t xml:space="preserve"> </w:t>
-      </w:r>
-      <w:proofErr w:type="spellStart"/>
-      <w:r>
-        <w:t>selfi</w:t>
-      </w:r>
-      <w:proofErr w:type="spellEnd"/>
-      <w:r>
-        <w:t xml:space="preserve"> </w:t>
-      </w:r>
-      <w:proofErr w:type="spellStart"/>
-      <w:r>
-        <w:t>fotografiju</w:t>
-      </w:r>
-      <w:proofErr w:type="spellEnd"/>
-      <w:r>
-        <w:t>.</w:t>
-      </w:r>
-    </w:p>
-    <w:p/>
-    <w:p>
-      <w:pPr>
-        <w:pStyle w:val="Heading2"/>
-        <w:rPr>
-          <w:b/>
-        </w:rPr>
-      </w:pPr>
-      <w:r>
-        <w:rPr>
-          <w:b/>
-        </w:rPr>
-        <w:t xml:space="preserve">4.3. Provera </w:t>
-      </w:r>
-      <w:proofErr w:type="spellStart"/>
-      <w:r>
-        <w:rPr>
-          <w:b/>
-        </w:rPr>
-        <w:t>Poreske</w:t>
-      </w:r>
-      <w:proofErr w:type="spellEnd"/>
-      <w:r>
-        <w:rPr>
-          <w:b/>
-        </w:rPr>
-        <w:t xml:space="preserve"> </w:t>
-      </w:r>
-      <w:proofErr w:type="spellStart"/>
-      <w:r>
-        <w:rPr>
-          <w:b/>
-        </w:rPr>
-        <w:t>Rezidentnosti</w:t>
-      </w:r>
-      <w:proofErr w:type="spellEnd"/>
-      <w:r>
-        <w:rPr>
-          <w:b/>
-        </w:rPr>
-        <w:t xml:space="preserve"> (</w:t>
-      </w:r>
-      <w:proofErr w:type="spellStart"/>
-      <w:r>
-        <w:rPr>
-          <w:b/>
-        </w:rPr>
-        <w:t>za</w:t>
-      </w:r>
-      <w:proofErr w:type="spellEnd"/>
-      <w:r>
-        <w:rPr>
-          <w:b/>
-        </w:rPr>
-        <w:t xml:space="preserve"> AML </w:t>
-      </w:r>
-      <w:proofErr w:type="spellStart"/>
-      <w:r>
-        <w:rPr>
-          <w:b/>
-        </w:rPr>
-        <w:t>standarde</w:t>
-      </w:r>
-      <w:proofErr w:type="spellEnd"/>
-      <w:r>
-        <w:rPr>
-          <w:b/>
-        </w:rPr>
-        <w:t>)</w:t>
-      </w:r>
-    </w:p>
-    <w:p>
-      <w:pPr>
-        <w:ind w:left="720" w:firstLine="0"/>
-      </w:pPr>
-      <w:proofErr w:type="spellStart"/>
-      <w:r>
-        <w:t>Korisnik</w:t>
-      </w:r>
-      <w:proofErr w:type="spellEnd"/>
-      <w:r>
-        <w:t xml:space="preserve"> </w:t>
-      </w:r>
-      <w:proofErr w:type="spellStart"/>
-      <w:r>
-        <w:t>treba</w:t>
-      </w:r>
-      <w:proofErr w:type="spellEnd"/>
-      <w:r>
-        <w:t xml:space="preserve"> da </w:t>
-      </w:r>
-      <w:proofErr w:type="spellStart"/>
-      <w:r>
-        <w:t>navede</w:t>
-      </w:r>
-      <w:proofErr w:type="spellEnd"/>
-      <w:r>
-        <w:t xml:space="preserve"> </w:t>
-      </w:r>
-      <w:proofErr w:type="spellStart"/>
-      <w:r>
-        <w:t>drzavy</w:t>
-      </w:r>
-      <w:proofErr w:type="spellEnd"/>
-      <w:r>
-        <w:t xml:space="preserve"> </w:t>
-      </w:r>
-      <w:proofErr w:type="spellStart"/>
-      <w:r>
-        <w:t>poreske</w:t>
-      </w:r>
-      <w:proofErr w:type="spellEnd"/>
-      <w:r>
-        <w:t xml:space="preserve"> </w:t>
-      </w:r>
-      <w:proofErr w:type="spellStart"/>
-      <w:r>
-        <w:t>rezidentnosti</w:t>
-      </w:r>
-      <w:proofErr w:type="spellEnd"/>
-      <w:r>
-        <w:t xml:space="preserve"> </w:t>
-      </w:r>
-      <w:proofErr w:type="spellStart"/>
-      <w:r>
-        <w:t>kao</w:t>
-      </w:r>
-      <w:proofErr w:type="spellEnd"/>
-      <w:r>
-        <w:t xml:space="preserve"> I TIN (Taxpayer Identification Number) </w:t>
-      </w:r>
-      <w:proofErr w:type="spellStart"/>
-      <w:r>
-        <w:t>ukoliko</w:t>
-      </w:r>
-      <w:proofErr w:type="spellEnd"/>
-      <w:r>
-        <w:t xml:space="preserve"> je </w:t>
-      </w:r>
-      <w:proofErr w:type="spellStart"/>
-      <w:r>
-        <w:t>primenljivo</w:t>
-      </w:r>
-      <w:proofErr w:type="spellEnd"/>
-      <w:r>
-        <w:t xml:space="preserve">. </w:t>
-      </w:r>
-      <w:proofErr w:type="spellStart"/>
-      <w:r>
-        <w:t>Podaci</w:t>
-      </w:r>
-      <w:proofErr w:type="spellEnd"/>
-      <w:r>
-        <w:t xml:space="preserve"> se </w:t>
-      </w:r>
-      <w:proofErr w:type="spellStart"/>
-      <w:r>
-        <w:t>uporedjuju</w:t>
-      </w:r>
-      <w:proofErr w:type="spellEnd"/>
-      <w:r>
-        <w:t xml:space="preserve"> </w:t>
-      </w:r>
-      <w:proofErr w:type="spellStart"/>
-      <w:r>
-        <w:t>na</w:t>
-      </w:r>
-      <w:proofErr w:type="spellEnd"/>
-      <w:r>
-        <w:t xml:space="preserve"> </w:t>
-      </w:r>
-      <w:proofErr w:type="spellStart"/>
-      <w:r>
-        <w:t>medjunarodnim</w:t>
-      </w:r>
-      <w:proofErr w:type="spellEnd"/>
-      <w:r>
-        <w:t xml:space="preserve"> </w:t>
-      </w:r>
-      <w:proofErr w:type="spellStart"/>
-      <w:r>
-        <w:t>bazama</w:t>
-      </w:r>
-      <w:proofErr w:type="spellEnd"/>
-      <w:r>
-        <w:t xml:space="preserve"> </w:t>
-      </w:r>
-      <w:proofErr w:type="spellStart"/>
-      <w:r>
-        <w:t>kako</w:t>
-      </w:r>
-      <w:proofErr w:type="spellEnd"/>
-      <w:r>
-        <w:t xml:space="preserve"> bi se </w:t>
-      </w:r>
-      <w:proofErr w:type="spellStart"/>
-      <w:r>
-        <w:t>sprecile</w:t>
-      </w:r>
-      <w:proofErr w:type="spellEnd"/>
-      <w:r>
-        <w:t xml:space="preserve"> </w:t>
-      </w:r>
-      <w:proofErr w:type="spellStart"/>
-      <w:r>
-        <w:t>sve</w:t>
-      </w:r>
-      <w:proofErr w:type="spellEnd"/>
-      <w:r>
-        <w:t xml:space="preserve"> </w:t>
-      </w:r>
-      <w:proofErr w:type="spellStart"/>
-      <w:r>
-        <w:t>prevare</w:t>
-      </w:r>
-      <w:proofErr w:type="spellEnd"/>
-      <w:r>
-        <w:t xml:space="preserve">, </w:t>
-      </w:r>
-      <w:proofErr w:type="spellStart"/>
-      <w:r>
-        <w:t>svako</w:t>
-      </w:r>
-      <w:proofErr w:type="spellEnd"/>
-      <w:r>
-        <w:t xml:space="preserve"> </w:t>
-      </w:r>
-      <w:proofErr w:type="spellStart"/>
-      <w:r>
-        <w:t>pranje</w:t>
-      </w:r>
-      <w:proofErr w:type="spellEnd"/>
-      <w:r>
-        <w:t xml:space="preserve"> </w:t>
-      </w:r>
-      <w:proofErr w:type="spellStart"/>
-      <w:r>
-        <w:t>novca</w:t>
-      </w:r>
-      <w:proofErr w:type="spellEnd"/>
-      <w:r>
-        <w:t xml:space="preserve"> </w:t>
-      </w:r>
-      <w:proofErr w:type="spellStart"/>
-      <w:r>
-        <w:t>ili</w:t>
-      </w:r>
-      <w:proofErr w:type="spellEnd"/>
-      <w:r>
-        <w:t xml:space="preserve"> </w:t>
-      </w:r>
-      <w:proofErr w:type="spellStart"/>
-      <w:r>
-        <w:t>druge</w:t>
-      </w:r>
-      <w:proofErr w:type="spellEnd"/>
-      <w:r>
-        <w:t xml:space="preserve"> </w:t>
-      </w:r>
-      <w:proofErr w:type="spellStart"/>
-      <w:r>
-        <w:t>ilegalne</w:t>
-      </w:r>
-      <w:proofErr w:type="spellEnd"/>
-      <w:r>
-        <w:t xml:space="preserve"> </w:t>
-      </w:r>
-      <w:proofErr w:type="spellStart"/>
-      <w:r>
-        <w:t>aktivnosti</w:t>
-      </w:r>
-      <w:proofErr w:type="spellEnd"/>
-      <w:r>
-        <w:t>.</w:t>
-      </w:r>
-    </w:p>
-    <w:p/>
-    <w:p>
-      <w:pPr>
-        <w:pStyle w:val="Heading2"/>
-        <w:rPr>
-          <w:b/>
-        </w:rPr>
-      </w:pPr>
-      <w:r>
-        <w:rPr>
-          <w:b/>
-        </w:rPr>
-        <w:t xml:space="preserve">4.4. </w:t>
-      </w:r>
-      <w:proofErr w:type="spellStart"/>
-      <w:r>
-        <w:rPr>
-          <w:b/>
-        </w:rPr>
-        <w:t>Dodatne</w:t>
-      </w:r>
-      <w:proofErr w:type="spellEnd"/>
-      <w:r>
-        <w:rPr>
-          <w:b/>
-        </w:rPr>
-        <w:t xml:space="preserve"> </w:t>
-      </w:r>
-      <w:proofErr w:type="spellStart"/>
-      <w:r>
-        <w:rPr>
-          <w:b/>
-        </w:rPr>
-        <w:t>Bezbednosne</w:t>
-      </w:r>
-      <w:proofErr w:type="spellEnd"/>
-      <w:r>
-        <w:rPr>
-          <w:b/>
-        </w:rPr>
-        <w:t xml:space="preserve"> Mere</w:t>
-      </w:r>
-    </w:p>
-    <w:p>
-      <w:r>
-        <w:t xml:space="preserve">- </w:t>
-      </w:r>
-      <w:proofErr w:type="spellStart"/>
-      <w:r>
-        <w:t>Dvostruka</w:t>
-      </w:r>
-      <w:proofErr w:type="spellEnd"/>
-      <w:r>
-        <w:t xml:space="preserve"> </w:t>
-      </w:r>
-      <w:proofErr w:type="spellStart"/>
-      <w:r>
-        <w:t>autentifikacija</w:t>
-      </w:r>
-      <w:proofErr w:type="spellEnd"/>
-      <w:r>
-        <w:t xml:space="preserve"> (2FA)</w:t>
-      </w:r>
-    </w:p>
-    <w:p>
-      <w:r>
-        <w:t xml:space="preserve">- </w:t>
-      </w:r>
-      <w:proofErr w:type="spellStart"/>
-      <w:r>
-        <w:t>Ogranicenje</w:t>
-      </w:r>
-      <w:proofErr w:type="spellEnd"/>
-      <w:r>
-        <w:t xml:space="preserve"> </w:t>
-      </w:r>
-      <w:proofErr w:type="spellStart"/>
-      <w:r>
-        <w:t>za</w:t>
-      </w:r>
-      <w:proofErr w:type="spellEnd"/>
-      <w:r>
-        <w:t xml:space="preserve"> </w:t>
-      </w:r>
-      <w:proofErr w:type="spellStart"/>
-      <w:r>
-        <w:t>rizicne</w:t>
-      </w:r>
-      <w:proofErr w:type="spellEnd"/>
-      <w:r>
-        <w:t xml:space="preserve"> IP </w:t>
-      </w:r>
-      <w:proofErr w:type="spellStart"/>
-      <w:r>
-        <w:t>adrese</w:t>
-      </w:r>
-      <w:proofErr w:type="spellEnd"/>
-    </w:p>
-    <w:p/>
-    <w:p>
-      <w:pPr>
-        <w:pStyle w:val="Heading2"/>
-        <w:rPr>
-          <w:b/>
-        </w:rPr>
-      </w:pPr>
-      <w:r>
-        <w:rPr>
-          <w:b/>
-        </w:rPr>
-        <w:t xml:space="preserve">4.5. </w:t>
-      </w:r>
-      <w:proofErr w:type="spellStart"/>
-      <w:r>
-        <w:rPr>
-          <w:b/>
-        </w:rPr>
-        <w:t>Periodična</w:t>
-      </w:r>
-      <w:proofErr w:type="spellEnd"/>
-      <w:r>
-        <w:rPr>
-          <w:b/>
-        </w:rPr>
-        <w:t xml:space="preserve"> </w:t>
-      </w:r>
-      <w:proofErr w:type="spellStart"/>
-      <w:r>
-        <w:rPr>
-          <w:b/>
-        </w:rPr>
-        <w:t>Verifikacija</w:t>
-      </w:r>
-      <w:proofErr w:type="spellEnd"/>
-    </w:p>
-    <w:p>
-      <w:pPr>
-        <w:ind w:left="720" w:firstLine="0"/>
-      </w:pPr>
-      <w:proofErr w:type="spellStart"/>
-      <w:r>
-        <w:t>Platforma</w:t>
-      </w:r>
-      <w:proofErr w:type="spellEnd"/>
-      <w:r>
-        <w:t xml:space="preserve"> </w:t>
-      </w:r>
-      <w:proofErr w:type="spellStart"/>
-      <w:r>
-        <w:t>ce</w:t>
-      </w:r>
-      <w:proofErr w:type="spellEnd"/>
-      <w:r>
-        <w:t xml:space="preserve"> </w:t>
-      </w:r>
-      <w:proofErr w:type="spellStart"/>
-      <w:r>
-        <w:t>periodicno</w:t>
-      </w:r>
-      <w:proofErr w:type="spellEnd"/>
-      <w:r>
-        <w:t xml:space="preserve"> </w:t>
-      </w:r>
-      <w:proofErr w:type="spellStart"/>
-      <w:r>
-        <w:t>traziti</w:t>
-      </w:r>
-      <w:proofErr w:type="spellEnd"/>
-      <w:r>
-        <w:t xml:space="preserve"> </w:t>
-      </w:r>
-      <w:proofErr w:type="spellStart"/>
-      <w:r>
-        <w:t>korisniku</w:t>
-      </w:r>
-      <w:proofErr w:type="spellEnd"/>
-      <w:r>
-        <w:t xml:space="preserve"> da </w:t>
-      </w:r>
-      <w:proofErr w:type="spellStart"/>
-      <w:r>
-        <w:t>potvrdi</w:t>
-      </w:r>
-      <w:proofErr w:type="spellEnd"/>
-      <w:r>
-        <w:t xml:space="preserve"> </w:t>
-      </w:r>
-      <w:proofErr w:type="spellStart"/>
-      <w:r>
-        <w:t>svoj</w:t>
-      </w:r>
-      <w:proofErr w:type="spellEnd"/>
-      <w:r>
-        <w:t xml:space="preserve"> </w:t>
-      </w:r>
-      <w:proofErr w:type="spellStart"/>
-      <w:r>
-        <w:t>identitet</w:t>
-      </w:r>
-      <w:proofErr w:type="spellEnd"/>
-      <w:r>
-        <w:t xml:space="preserve">, </w:t>
-      </w:r>
-      <w:proofErr w:type="spellStart"/>
-      <w:r>
-        <w:t>posebno</w:t>
-      </w:r>
-      <w:proofErr w:type="spellEnd"/>
-      <w:r>
-        <w:t xml:space="preserve"> </w:t>
-      </w:r>
-      <w:proofErr w:type="spellStart"/>
-      <w:r>
-        <w:t>ako</w:t>
-      </w:r>
-      <w:proofErr w:type="spellEnd"/>
-      <w:r>
-        <w:t xml:space="preserve"> je </w:t>
+        <w:rPr>
+          <w:lang w:val="de-DE"/>
+        </w:rPr>
+      </w:pPr>
+      <w:r>
+        <w:rPr>
+          <w:lang w:val="de-DE"/>
+        </w:rPr>
+        <w:t>Platforma ce periodicno traziti korisniku da potvrdi svoj identitet, posebno ako je detektovana sumnjiva aktivnost ili ukoliko korisnik nije duze koristio svoj nalog.</w:t>
       </w:r>
       <w:bookmarkStart w:id="0" w:name="_GoBack"/>
       <w:bookmarkEnd w:id="0"/>
-      <w:proofErr w:type="spellStart"/>
-      <w:r>
-        <w:t>detektovana</w:t>
-      </w:r>
-      <w:proofErr w:type="spellEnd"/>
-      <w:r>
-        <w:t xml:space="preserve"> </w:t>
-      </w:r>
-      <w:proofErr w:type="spellStart"/>
-      <w:r>
-        <w:t>sumnjiva</w:t>
-      </w:r>
-      <w:proofErr w:type="spellEnd"/>
-      <w:r>
-        <w:t xml:space="preserve"> </w:t>
-      </w:r>
-      <w:proofErr w:type="spellStart"/>
-      <w:r>
-        <w:t>aktivnost</w:t>
-      </w:r>
-      <w:proofErr w:type="spellEnd"/>
-      <w:r>
-        <w:t xml:space="preserve"> </w:t>
-      </w:r>
-      <w:proofErr w:type="spellStart"/>
-      <w:r>
-        <w:t>ili</w:t>
-      </w:r>
-      <w:proofErr w:type="spellEnd"/>
-      <w:r>
-        <w:t xml:space="preserve"> </w:t>
-      </w:r>
-      <w:proofErr w:type="spellStart"/>
-      <w:r>
-        <w:t>ukoliko</w:t>
-      </w:r>
-      <w:proofErr w:type="spellEnd"/>
-      <w:r>
-        <w:t xml:space="preserve"> </w:t>
-      </w:r>
-      <w:proofErr w:type="spellStart"/>
-      <w:r>
-        <w:t>korisnik</w:t>
-      </w:r>
-      <w:proofErr w:type="spellEnd"/>
-      <w:r>
-        <w:t xml:space="preserve"> </w:t>
-      </w:r>
-      <w:proofErr w:type="spellStart"/>
-      <w:r>
-        <w:t>nije</w:t>
-      </w:r>
-      <w:proofErr w:type="spellEnd"/>
-      <w:r>
-        <w:t xml:space="preserve"> </w:t>
-      </w:r>
-      <w:proofErr w:type="spellStart"/>
-      <w:r>
-        <w:t>duze</w:t>
-      </w:r>
-      <w:proofErr w:type="spellEnd"/>
-      <w:r>
-        <w:t xml:space="preserve"> </w:t>
-      </w:r>
-      <w:proofErr w:type="spellStart"/>
-      <w:r>
-        <w:t>koristio</w:t>
-      </w:r>
-      <w:proofErr w:type="spellEnd"/>
-      <w:r>
-        <w:t xml:space="preserve"> </w:t>
-      </w:r>
-      <w:proofErr w:type="spellStart"/>
-      <w:r>
-        <w:t>svoj</w:t>
-      </w:r>
-      <w:proofErr w:type="spellEnd"/>
-      <w:r>
-        <w:t xml:space="preserve"> </w:t>
-      </w:r>
-      <w:proofErr w:type="spellStart"/>
-      <w:r>
-        <w:t>nalog</w:t>
-      </w:r>
-      <w:proofErr w:type="spellEnd"/>
-      <w:r>
-        <w:t>.</w:t>
-      </w:r>
+    </w:p>
+    <w:p>
+      <w:pPr>
+        <w:rPr>
+          <w:lang w:val="de-DE"/>
+        </w:rPr>
+      </w:pPr>
     </w:p>
     <w:p>
       <w:pPr>

</xml_diff>